<commit_message>
Fix doc: fetch_rmse citation and false LASSO/X4 efficiency claim
Technical Documentation.docx cited a non-existent frontend function
(fetch_evaluation_metrics); the real function is fetch_rmse. It also
claimed LASSO was skipped on X4 because LASSO "is not computationally
efficient" with many predictors, which is backwards - LASSO is used in
the literature with far larger predictor sets. The actual bottleneck is
this project's hdmpy-based LASSO implementation being slow on X4's
column count. Edits made via scripted python-docx replacements using a
new shared helper module (scripts/docx_edit_helpers.py) that later
doc-correction tasks in this pass will reuse.
</commit_message>
<xml_diff>
--- a/Technical Documentation.docx
+++ b/Technical Documentation.docx
@@ -383,13 +383,12 @@
           <w:bCs w:val="1"/>
           <w:rtl w:val="0"/>
         </w:rPr>
-        <w:t xml:space="preserve">1.2.2 Front End Data flow: </w:t>
-      </w:r>
-      <w:r>
-        <w:rPr>
-          <w:rtl w:val="0"/>
-        </w:rPr>
-        <w:t xml:space="preserve">The model_forecasts table is the single interface between backend pipeline and frontend. On the frontend, four data access functions are defined as clean stubs with documented table schemas: fetch_nowcast_data retrieves model predictions for a selected quarter, fetch_confidence_intervals retrieves the corresponding uncertainty bounds for a chosen model, fetch_historical_data retrieves actuals and model predictions over a user-specified date range conditioned on the flash estimate month, and fetch_evaluation_metrics retrieves RMSE for selected models. Each function queries Supabase directly, returning live model outputs to the frontend. No model estimation occurs at runtime; all nowcast values are pre-computated and stored, keeping the frontend lightweight and responsive. </w:t>
+        <w:t xml:space="preserve">1.2.2 Front End Data flow: The model_forecasts table is the single interface between backend pipeline and frontend. On the frontend, four data access functions are defined as clean stubs with documented table schemas: fetch_nowcast_data retrieves model predictions for a selected quarter, fetch_confidence_intervals retrieves the corresponding uncertainty bounds for a chosen model, fetch_historical_data retrieves actuals and model predictions over a user-specified date range conditioned on the flash estimate month, and fetch_rmse retrieves RMSE for selected models. Each function queries Supabase directly, returning live model outputs to the frontend. No model estimation occurs at runtime; all nowcast values are pre-computated and stored, keeping the frontend lightweight and responsive. </w:t>
+      </w:r>
+      <w:r>
+        <w:rPr>
+          <w:rtl w:val="0"/>
+        </w:rPr>
       </w:r>
     </w:p>
     <w:p>
@@ -2816,7 +2815,7 @@
         <w:rPr>
           <w:rtl w:val="0"/>
         </w:rPr>
-        <w:t xml:space="preserve">The Final Model was either LASSO or Random Forest. These two models were chosen because LASSO and Random Forest are models that perform some kind of feature selection, which performs better on high dimensional models like ours, with a similar number of both number of observations and number of predictors. Both LASSO and Random Forest was run on the four different feature matrices, with some exceptions: LASSO was not run on X4, because there are too many variables for it to be computationally efficient; Random Forests was not run on X1 or X3, because Random Forest performs better with more variables, and the design matrices with lags added were used.</w:t>
+        <w:t>The Final Model was either LASSO or Random Forest. These two models were chosen because LASSO and Random Forest are models that perform some kind of feature selection, which performs better on high dimensional models like ours, with a similar number of both number of observations and number of predictors. Both LASSO and Random Forest was run on the four different feature matrices, with some exceptions: LASSO was not run on X4 because our current hdmpy-based implementation does not complete in reasonable time on X4's column count; LASSO itself is used in the literature with far larger predictor sets; Random Forests was not run on X1 or X3, because Random Forest performs better with more variables, and the design matrices with lags added were used.</w:t>
       </w:r>
     </w:p>
     <w:p>

</xml_diff>

<commit_message>
Doc: state Gaussian CI assumption + COVID tightness caveat, fix DM to squared loss
</commit_message>
<xml_diff>
--- a/Technical Documentation.docx
+++ b/Technical Documentation.docx
@@ -4123,19 +4123,17 @@
         <w:rPr>
           <w:rtl w:val="0"/>
         </w:rPr>
-        <w:t xml:space="preserve">Confidence intervals for each nowcast are calculated based on the RMSE of predictions in the test set. The training data used to predict each test set point takes the latest released values for the indicators in the previous quarters, which results in seemingly very accurate predictions. These residuals, however, are not representative of our monthly predictions. Our monthly predictions are limited to using ragged-edge filled values and flash estimates of features. As such, calculating confidence intervals from the training data is unable to produce realistic intervals for each test set point, because the residuals in the training set are too small. Hence, update_ci_columns() in ci_update.py takes the RMSE values from the </w:t>
-      </w:r>
-      <w:r>
-        <w:rPr>
-          <w:rtl w:val="0"/>
-        </w:rPr>
-        <w:t xml:space="preserve">rmse</w:t>
-      </w:r>
-      <w:r>
-        <w:rPr>
-          <w:rtl w:val="0"/>
-        </w:rPr>
-        <w:t xml:space="preserve"> Supabase table directly to multiply it with the 50% and 80% critical values to obtain a confidence interval for each model version.</w:t>
+        <w:t>Confidence intervals for each nowcast are calculated based on the RMSE of predictions in the test set. The training data used to predict each test set point takes the latest released values for the indicators in the previous quarters, which results in seemingly very accurate predictions. These residuals, however, are not representative of our monthly predictions. Our monthly predictions are limited to using ragged-edge filled values and flash estimates of features. As such, calculating confidence intervals from the training data is unable to produce realistic intervals for each test set point, because the residuals in the training set are too small. Hence, update_ci_columns() in ci_update.py takes the RMSE values from the rmse Supabase table directly to multiply it with the 50% and 80% Gaussian critical values (0.674 and 1.282) to obtain a confidence interval for each model version, assuming forecast errors are approximately Normally distributed. Because RMSE excludes the 2020 COVID-19 quarters as outliers (Section 2.3.2), these intervals also exclude that tail-event variance, which likely makes them tighter than the true unconditional uncertainty in GDP growth.</w:t>
+      </w:r>
+      <w:r>
+        <w:rPr>
+          <w:rtl w:val="0"/>
+        </w:rPr>
+      </w:r>
+      <w:r>
+        <w:rPr>
+          <w:rtl w:val="0"/>
+        </w:rPr>
       </w:r>
     </w:p>
     <w:p>
@@ -4170,7 +4168,7 @@
         <w:rPr>
           <w:rtl w:val="0"/>
         </w:rPr>
-        <w:t xml:space="preserve">The Diebold-Mariano (DM) test is a statistical test used to determine whether the difference in predictive accuracy between two competing forecasting models is statistically significant. In dm_test.py, the latest forecast data from the model_forecast table in Supabase is fetched to provide the nowcasts from each model. The function dm_test() outputs the DM test statistic based on these nowcasts. In dm_test(), the difference in the loss for each unique model pair is first calculated. Mean Absolute Error (MAE) is used in this case to reduce the impact of big errors. A regression on a constant using the OLS function in statsmodels was used to obtain the heteroskedastic and autocorrelation consistent standard errors for the difference based on Newey &amp; West (1994). Additionally, because the sample size is relatively small (n=97), the correction proposed by Harvey et. al. (1998) for finite sample sizes was used to obtain a more accurate DM test statistic. P values were calculated using a two-tailed test on a T distribution with n-1 degrees of freedom.</w:t>
+        <w:t>The Diebold-Mariano (DM) test is a statistical test used to determine whether the difference in predictive accuracy between two competing forecasting models is statistically significant. In dm_test.py, the latest forecast data from the model_forecast table in Supabase is fetched to provide the nowcasts from each model. The function dm_test() outputs the DM test statistic based on these nowcasts. In dm_test(), the difference in the loss for each unique model pair is first calculated. Squared error is used in this case, consistent with the RMSE figures reported alongside each DM test. A regression on a constant using the OLS function in statsmodels was used to obtain the heteroskedastic and autocorrelation consistent standard errors for the difference based on Newey &amp; West (1994). Additionally, because the sample size is relatively small (n=97), the correction proposed by Harvey et. al. (1998) for finite sample sizes was used to obtain a more accurate DM test statistic. P values were calculated using a two-tailed test on a T distribution with n-1 degrees of freedom.</w:t>
       </w:r>
     </w:p>
     <w:p>

</xml_diff>

<commit_message>
Doc: remove redundant mean-RMSE-per-version table, point to Table 5 instead
</commit_message>
<xml_diff>
--- a/Technical Documentation.docx
+++ b/Technical Documentation.docx
@@ -4248,322 +4248,17 @@
         <w:rPr>
           <w:rtl w:val="0"/>
         </w:rPr>
-        <w:t xml:space="preserve">Comparing the mean RMSE of each version, we see that unsurprisingly, the best nowcasts are made later in the prediction window, as more data is available (see Table 4). Version 6 nowcasts tended to be exceptionally accurate, which reflects the possibility that the GDP flash estimates would already be out at this time, along with other macroeconomic indicators that are calculated in the same fashion. Because our POOS does not take into account data vintages, this means that our version 6 nowcasts might be taking in the latest “true” indicators and hence there may be data leakage occurring.</w:t>
-      </w:r>
-    </w:p>
-    <w:p>
-      <w:pPr>
-        <w:rPr/>
-      </w:pPr>
-      <w:r>
-        <w:rPr>
-          <w:rtl w:val="0"/>
-        </w:rPr>
-      </w:r>
-    </w:p>
-    <w:tbl>
-      <w:tblPr>
-        <w:tblStyle w:val="Table4"/>
-        <w:tblW w:w="9000.0" w:type="dxa"/>
-        <w:jc w:val="left"/>
-        <w:tblBorders>
-          <w:top w:color="000000" w:space="0" w:sz="6" w:val="single"/>
-          <w:left w:color="000000" w:space="0" w:sz="6" w:val="single"/>
-          <w:bottom w:color="000000" w:space="0" w:sz="6" w:val="single"/>
-          <w:right w:color="000000" w:space="0" w:sz="6" w:val="single"/>
-          <w:insideH w:color="000000" w:space="0" w:sz="6" w:val="single"/>
-          <w:insideV w:color="000000" w:space="0" w:sz="6" w:val="single"/>
-        </w:tblBorders>
-        <w:tblLayout w:type="fixed"/>
-        <w:tblLook w:val="0600"/>
-      </w:tblPr>
-      <w:tblGrid>
-        <w:gridCol w:w="1725"/>
-        <w:gridCol w:w="7275"/>
-        <w:tblGridChange w:id="0">
-          <w:tblGrid>
-            <w:gridCol w:w="1725"/>
-            <w:gridCol w:w="7275"/>
-          </w:tblGrid>
-        </w:tblGridChange>
-      </w:tblGrid>
-      <w:tr>
-        <w:trPr>
-          <w:cantSplit w:val="0"/>
-          <w:tblHeader w:val="0"/>
-        </w:trPr>
-        <w:tc>
-          <w:tcPr/>
-          <w:p>
-            <w:pPr>
-              <w:widowControl w:val="0"/>
-              <w:jc w:val="left"/>
-              <w:rPr/>
-            </w:pPr>
-            <w:r>
-              <w:rPr>
-                <w:rtl w:val="0"/>
-              </w:rPr>
-              <w:t xml:space="preserve">Version</w:t>
-            </w:r>
-          </w:p>
-        </w:tc>
-        <w:tc>
-          <w:tcPr/>
-          <w:p>
-            <w:pPr>
-              <w:widowControl w:val="0"/>
-              <w:jc w:val="left"/>
-              <w:rPr/>
-            </w:pPr>
-            <w:r>
-              <w:rPr>
-                <w:rtl w:val="0"/>
-              </w:rPr>
-              <w:t xml:space="preserve">Mean RMSE across all models</w:t>
-            </w:r>
-          </w:p>
-        </w:tc>
-      </w:tr>
-      <w:tr>
-        <w:trPr>
-          <w:cantSplit w:val="0"/>
-          <w:tblHeader w:val="0"/>
-        </w:trPr>
-        <w:tc>
-          <w:tcPr/>
-          <w:p>
-            <w:pPr>
-              <w:widowControl w:val="0"/>
-              <w:jc w:val="left"/>
-              <w:rPr/>
-            </w:pPr>
-            <w:r>
-              <w:rPr>
-                <w:rtl w:val="0"/>
-              </w:rPr>
-              <w:t xml:space="preserve">6</w:t>
-            </w:r>
-          </w:p>
-        </w:tc>
-        <w:tc>
-          <w:tcPr/>
-          <w:p>
-            <w:pPr>
-              <w:widowControl w:val="0"/>
-              <w:jc w:val="left"/>
-              <w:rPr/>
-            </w:pPr>
-            <w:r>
-              <w:rPr>
-                <w:rtl w:val="0"/>
-              </w:rPr>
-              <w:t xml:space="preserve">1.129</w:t>
-            </w:r>
-          </w:p>
-        </w:tc>
-      </w:tr>
-      <w:tr>
-        <w:trPr>
-          <w:cantSplit w:val="0"/>
-          <w:tblHeader w:val="0"/>
-        </w:trPr>
-        <w:tc>
-          <w:tcPr/>
-          <w:p>
-            <w:pPr>
-              <w:widowControl w:val="0"/>
-              <w:jc w:val="left"/>
-              <w:rPr/>
-            </w:pPr>
-            <w:r>
-              <w:rPr>
-                <w:rtl w:val="0"/>
-              </w:rPr>
-              <w:t xml:space="preserve">5</w:t>
-            </w:r>
-          </w:p>
-        </w:tc>
-        <w:tc>
-          <w:tcPr/>
-          <w:p>
-            <w:pPr>
-              <w:widowControl w:val="0"/>
-              <w:jc w:val="left"/>
-              <w:rPr/>
-            </w:pPr>
-            <w:r>
-              <w:rPr>
-                <w:rtl w:val="0"/>
-              </w:rPr>
-              <w:t xml:space="preserve">2.174</w:t>
-            </w:r>
-          </w:p>
-        </w:tc>
-      </w:tr>
-      <w:tr>
-        <w:trPr>
-          <w:cantSplit w:val="0"/>
-          <w:tblHeader w:val="0"/>
-        </w:trPr>
-        <w:tc>
-          <w:tcPr/>
-          <w:p>
-            <w:pPr>
-              <w:widowControl w:val="0"/>
-              <w:jc w:val="left"/>
-              <w:rPr/>
-            </w:pPr>
-            <w:r>
-              <w:rPr>
-                <w:rtl w:val="0"/>
-              </w:rPr>
-              <w:t xml:space="preserve">4</w:t>
-            </w:r>
-          </w:p>
-        </w:tc>
-        <w:tc>
-          <w:tcPr/>
-          <w:p>
-            <w:pPr>
-              <w:widowControl w:val="0"/>
-              <w:jc w:val="left"/>
-              <w:rPr/>
-            </w:pPr>
-            <w:r>
-              <w:rPr>
-                <w:rtl w:val="0"/>
-              </w:rPr>
-              <w:t xml:space="preserve">2.316</w:t>
-            </w:r>
-          </w:p>
-        </w:tc>
-      </w:tr>
-      <w:tr>
-        <w:trPr>
-          <w:cantSplit w:val="0"/>
-          <w:tblHeader w:val="0"/>
-        </w:trPr>
-        <w:tc>
-          <w:tcPr/>
-          <w:p>
-            <w:pPr>
-              <w:widowControl w:val="0"/>
-              <w:jc w:val="left"/>
-              <w:rPr/>
-            </w:pPr>
-            <w:r>
-              <w:rPr>
-                <w:rtl w:val="0"/>
-              </w:rPr>
-              <w:t xml:space="preserve">3</w:t>
-            </w:r>
-          </w:p>
-        </w:tc>
-        <w:tc>
-          <w:tcPr/>
-          <w:p>
-            <w:pPr>
-              <w:widowControl w:val="0"/>
-              <w:jc w:val="left"/>
-              <w:rPr/>
-            </w:pPr>
-            <w:r>
-              <w:rPr>
-                <w:rtl w:val="0"/>
-              </w:rPr>
-              <w:t xml:space="preserve">2.326</w:t>
-            </w:r>
-          </w:p>
-        </w:tc>
-      </w:tr>
-      <w:tr>
-        <w:trPr>
-          <w:cantSplit w:val="0"/>
-          <w:tblHeader w:val="0"/>
-        </w:trPr>
-        <w:tc>
-          <w:tcPr/>
-          <w:p>
-            <w:pPr>
-              <w:widowControl w:val="0"/>
-              <w:jc w:val="left"/>
-              <w:rPr/>
-            </w:pPr>
-            <w:r>
-              <w:rPr>
-                <w:rtl w:val="0"/>
-              </w:rPr>
-              <w:t xml:space="preserve">2</w:t>
-            </w:r>
-          </w:p>
-        </w:tc>
-        <w:tc>
-          <w:tcPr/>
-          <w:p>
-            <w:pPr>
-              <w:widowControl w:val="0"/>
-              <w:jc w:val="left"/>
-              <w:rPr/>
-            </w:pPr>
-            <w:r>
-              <w:rPr>
-                <w:rtl w:val="0"/>
-              </w:rPr>
-              <w:t xml:space="preserve">2.343</w:t>
-            </w:r>
-          </w:p>
-        </w:tc>
-      </w:tr>
-      <w:tr>
-        <w:trPr>
-          <w:cantSplit w:val="0"/>
-          <w:tblHeader w:val="0"/>
-        </w:trPr>
-        <w:tc>
-          <w:tcPr/>
-          <w:p>
-            <w:pPr>
-              <w:widowControl w:val="0"/>
-              <w:jc w:val="left"/>
-              <w:rPr/>
-            </w:pPr>
-            <w:r>
-              <w:rPr>
-                <w:rtl w:val="0"/>
-              </w:rPr>
-              <w:t xml:space="preserve">1</w:t>
-            </w:r>
-          </w:p>
-        </w:tc>
-        <w:tc>
-          <w:tcPr/>
-          <w:p>
-            <w:pPr>
-              <w:widowControl w:val="0"/>
-              <w:jc w:val="left"/>
-              <w:rPr/>
-            </w:pPr>
-            <w:r>
-              <w:rPr>
-                <w:rtl w:val="0"/>
-              </w:rPr>
-              <w:t xml:space="preserve">2.456</w:t>
-            </w:r>
-          </w:p>
-        </w:tc>
-      </w:tr>
-    </w:tbl>
-    <w:p>
-      <w:pPr>
-        <w:jc w:val="center"/>
-        <w:rPr/>
-      </w:pPr>
-      <w:r>
-        <w:rPr>
-          <w:rtl w:val="0"/>
-        </w:rPr>
-        <w:t xml:space="preserve">Table 4: Mean RMSE across all models</w:t>
+        <w:t>Comparing the mean RMSE of each version, we see that unsurprisingly, the best nowcasts are made later in the prediction window, as more data is available (visible directly in Table 5, which reports RMSE by model across all 6 versions). Version 6 nowcasts tended to be exceptionally accurate, which reflects the possibility that the GDP flash estimates would already be out at this time, along with other macroeconomic indicators that are calculated in the same fashion. Because our POOS does not take into account data vintages, this means that our version 6 nowcasts might be taking in the latest “true” indicators and hence there may be data leakage occurring.</w:t>
+      </w:r>
+    </w:p>
+    <w:p>
+      <w:pPr>
+        <w:rPr/>
+      </w:pPr>
+      <w:r>
+        <w:rPr>
+          <w:rtl w:val="0"/>
+        </w:rPr>
       </w:r>
     </w:p>
     <w:p>

</xml_diff>

<commit_message>
Doc: add page numbers to every section's footer
</commit_message>
<xml_diff>
--- a/Technical Documentation.docx
+++ b/Technical Documentation.docx
@@ -37,6 +37,7 @@
           <w:vertAlign w:val="baseline"/>
         </w:rPr>
         <w:sectPr>
+          <w:footerReference w:type="default" r:id="rId28"/>
           <w:pgSz w:h="16838" w:w="11906" w:orient="portrait"/>
           <w:pgMar w:bottom="1440" w:top="1440" w:left="1440" w:right="1440" w:header="720" w:footer="720"/>
           <w:pgNumType w:start="1"/>
@@ -20087,6 +20088,7 @@
         </w:rPr>
         <w:sectPr>
           <w:headerReference r:id="rId25" w:type="default"/>
+          <w:footerReference w:type="default" r:id="rId29"/>
           <w:type w:val="nextPage"/>
           <w:pgSz w:h="16838" w:w="11906" w:orient="portrait"/>
           <w:pgMar w:bottom="1440" w:top="1440" w:left="1440" w:right="1440" w:header="720" w:footer="720"/>
@@ -20123,6 +20125,7 @@
         </w:rPr>
         <w:sectPr>
           <w:headerReference r:id="rId26" w:type="default"/>
+          <w:footerReference w:type="default" r:id="rId30"/>
           <w:type w:val="nextPage"/>
           <w:pgSz w:h="16838" w:w="11906" w:orient="portrait"/>
           <w:pgMar w:bottom="1440" w:top="1440" w:left="1440" w:right="1440" w:header="720" w:footer="720"/>
@@ -20570,6 +20573,7 @@
     </w:p>
     <w:sectPr>
       <w:headerReference r:id="rId27" w:type="default"/>
+      <w:footerReference w:type="default" r:id="rId31"/>
       <w:type w:val="nextPage"/>
       <w:pgSz w:h="16838" w:w="11906" w:orient="portrait"/>
       <w:pgMar w:bottom="1440" w:top="1440" w:left="1440" w:right="1440" w:header="720" w:footer="720"/>
@@ -20577,6 +20581,70 @@
     </w:sectPr>
   </w:body>
 </w:document>
+</file>
+
+<file path=word/footer1.xml><?xml version="1.0" encoding="utf-8"?>
+<w:ftr xmlns:m="http://schemas.openxmlformats.org/officeDocument/2006/math" xmlns:mc="http://schemas.openxmlformats.org/markup-compatibility/2006" xmlns:mo="http://schemas.microsoft.com/office/mac/office/2008/main" xmlns:mv="urn:schemas-microsoft-com:mac:vml" xmlns:o="urn:schemas-microsoft-com:office:office" xmlns:r="http://schemas.openxmlformats.org/officeDocument/2006/relationships" xmlns:v="urn:schemas-microsoft-com:vml" xmlns:w10="urn:schemas-microsoft-com:office:word" xmlns:w14="http://schemas.microsoft.com/office/word/2010/wordml" xmlns:w="http://schemas.openxmlformats.org/wordprocessingml/2006/main" xmlns:wne="http://schemas.microsoft.com/office/word/2006/wordml" xmlns:wp14="http://schemas.microsoft.com/office/word/2010/wordprocessingDrawing" xmlns:wp="http://schemas.openxmlformats.org/drawingml/2006/wordprocessingDrawing" xmlns:wpc="http://schemas.microsoft.com/office/word/2010/wordprocessingCanvas" xmlns:wpg="http://schemas.microsoft.com/office/word/2010/wordprocessingGroup" xmlns:wpi="http://schemas.microsoft.com/office/word/2010/wordprocessingInk" xmlns:wps="http://schemas.microsoft.com/office/word/2010/wordprocessingShape" mc:Ignorable="w14 wp14">
+  <w:p>
+    <w:pPr>
+      <w:pStyle w:val="Footer"/>
+      <w:jc w:val="center"/>
+    </w:pPr>
+    <w:r>
+      <w:fldChar w:fldCharType="begin"/>
+      <w:instrText xml:space="preserve">PAGE</w:instrText>
+      <w:fldChar w:fldCharType="end"/>
+    </w:r>
+  </w:p>
+</w:ftr>
+</file>
+
+<file path=word/footer2.xml><?xml version="1.0" encoding="utf-8"?>
+<w:ftr xmlns:m="http://schemas.openxmlformats.org/officeDocument/2006/math" xmlns:mc="http://schemas.openxmlformats.org/markup-compatibility/2006" xmlns:mo="http://schemas.microsoft.com/office/mac/office/2008/main" xmlns:mv="urn:schemas-microsoft-com:mac:vml" xmlns:o="urn:schemas-microsoft-com:office:office" xmlns:r="http://schemas.openxmlformats.org/officeDocument/2006/relationships" xmlns:v="urn:schemas-microsoft-com:vml" xmlns:w10="urn:schemas-microsoft-com:office:word" xmlns:w14="http://schemas.microsoft.com/office/word/2010/wordml" xmlns:w="http://schemas.openxmlformats.org/wordprocessingml/2006/main" xmlns:wne="http://schemas.microsoft.com/office/word/2006/wordml" xmlns:wp14="http://schemas.microsoft.com/office/word/2010/wordprocessingDrawing" xmlns:wp="http://schemas.openxmlformats.org/drawingml/2006/wordprocessingDrawing" xmlns:wpc="http://schemas.microsoft.com/office/word/2010/wordprocessingCanvas" xmlns:wpg="http://schemas.microsoft.com/office/word/2010/wordprocessingGroup" xmlns:wpi="http://schemas.microsoft.com/office/word/2010/wordprocessingInk" xmlns:wps="http://schemas.microsoft.com/office/word/2010/wordprocessingShape" mc:Ignorable="w14 wp14">
+  <w:p>
+    <w:pPr>
+      <w:pStyle w:val="Footer"/>
+      <w:jc w:val="center"/>
+    </w:pPr>
+    <w:r>
+      <w:fldChar w:fldCharType="begin"/>
+      <w:instrText xml:space="preserve">PAGE</w:instrText>
+      <w:fldChar w:fldCharType="end"/>
+    </w:r>
+  </w:p>
+</w:ftr>
+</file>
+
+<file path=word/footer3.xml><?xml version="1.0" encoding="utf-8"?>
+<w:ftr xmlns:m="http://schemas.openxmlformats.org/officeDocument/2006/math" xmlns:mc="http://schemas.openxmlformats.org/markup-compatibility/2006" xmlns:mo="http://schemas.microsoft.com/office/mac/office/2008/main" xmlns:mv="urn:schemas-microsoft-com:mac:vml" xmlns:o="urn:schemas-microsoft-com:office:office" xmlns:r="http://schemas.openxmlformats.org/officeDocument/2006/relationships" xmlns:v="urn:schemas-microsoft-com:vml" xmlns:w10="urn:schemas-microsoft-com:office:word" xmlns:w14="http://schemas.microsoft.com/office/word/2010/wordml" xmlns:w="http://schemas.openxmlformats.org/wordprocessingml/2006/main" xmlns:wne="http://schemas.microsoft.com/office/word/2006/wordml" xmlns:wp14="http://schemas.microsoft.com/office/word/2010/wordprocessingDrawing" xmlns:wp="http://schemas.openxmlformats.org/drawingml/2006/wordprocessingDrawing" xmlns:wpc="http://schemas.microsoft.com/office/word/2010/wordprocessingCanvas" xmlns:wpg="http://schemas.microsoft.com/office/word/2010/wordprocessingGroup" xmlns:wpi="http://schemas.microsoft.com/office/word/2010/wordprocessingInk" xmlns:wps="http://schemas.microsoft.com/office/word/2010/wordprocessingShape" mc:Ignorable="w14 wp14">
+  <w:p>
+    <w:pPr>
+      <w:pStyle w:val="Footer"/>
+      <w:jc w:val="center"/>
+    </w:pPr>
+    <w:r>
+      <w:fldChar w:fldCharType="begin"/>
+      <w:instrText xml:space="preserve">PAGE</w:instrText>
+      <w:fldChar w:fldCharType="end"/>
+    </w:r>
+  </w:p>
+</w:ftr>
+</file>
+
+<file path=word/footer4.xml><?xml version="1.0" encoding="utf-8"?>
+<w:ftr xmlns:m="http://schemas.openxmlformats.org/officeDocument/2006/math" xmlns:mc="http://schemas.openxmlformats.org/markup-compatibility/2006" xmlns:mo="http://schemas.microsoft.com/office/mac/office/2008/main" xmlns:mv="urn:schemas-microsoft-com:mac:vml" xmlns:o="urn:schemas-microsoft-com:office:office" xmlns:r="http://schemas.openxmlformats.org/officeDocument/2006/relationships" xmlns:v="urn:schemas-microsoft-com:vml" xmlns:w10="urn:schemas-microsoft-com:office:word" xmlns:w14="http://schemas.microsoft.com/office/word/2010/wordml" xmlns:w="http://schemas.openxmlformats.org/wordprocessingml/2006/main" xmlns:wne="http://schemas.microsoft.com/office/word/2006/wordml" xmlns:wp14="http://schemas.microsoft.com/office/word/2010/wordprocessingDrawing" xmlns:wp="http://schemas.openxmlformats.org/drawingml/2006/wordprocessingDrawing" xmlns:wpc="http://schemas.microsoft.com/office/word/2010/wordprocessingCanvas" xmlns:wpg="http://schemas.microsoft.com/office/word/2010/wordprocessingGroup" xmlns:wpi="http://schemas.microsoft.com/office/word/2010/wordprocessingInk" xmlns:wps="http://schemas.microsoft.com/office/word/2010/wordprocessingShape" mc:Ignorable="w14 wp14">
+  <w:p>
+    <w:pPr>
+      <w:pStyle w:val="Footer"/>
+      <w:jc w:val="center"/>
+    </w:pPr>
+    <w:r>
+      <w:fldChar w:fldCharType="begin"/>
+      <w:instrText xml:space="preserve">PAGE</w:instrText>
+      <w:fldChar w:fldCharType="end"/>
+    </w:r>
+  </w:p>
+</w:ftr>
 </file>
 
 <file path=word/footnotes.xml><?xml version="1.0" encoding="utf-8"?>

</xml_diff>

<commit_message>
Doc: remove Lorem-ipsum DM screenshot mockup, note real capture is pending
</commit_message>
<xml_diff>
--- a/Technical Documentation.docx
+++ b/Technical Documentation.docx
@@ -6602,47 +6602,10 @@
         </w:rPr>
         <w:t xml:space="preserve">We took care to minimise the user’s memory load by making objects, actions, and options visible and easily retrievable. Within the onboarding wizard we ensure that the user understands the different functionalities of the app as well as certain pieces of information that may be more technical (e.g. what the ‘flash estimate’ under the Historical Data tab’s display options refers to). Beyond this initial user orientation, we have several tooltips integrated into the interface so that the user can retrieve this information whenever they need it. This ensures that the user does not have to remember information from one part of the interface after they have navigated to another section. Additionally, in the DM statistics table overlay, the RMSE values are still provided on the side for easy reference so that users are able to assess the differences in RMSE values for the different models using the appropriate DM test p-value.</w:t>
       </w:r>
-      <w:r>
-        <w:drawing>
-          <wp:anchor allowOverlap="1" behindDoc="0" distB="114300" distT="114300" distL="114300" distR="114300" hidden="0" layoutInCell="1" locked="0" relativeHeight="0" simplePos="0">
-            <wp:simplePos x="0" y="0"/>
-            <wp:positionH relativeFrom="column">
-              <wp:posOffset>57151</wp:posOffset>
-            </wp:positionH>
-            <wp:positionV relativeFrom="paragraph">
-              <wp:posOffset>134268</wp:posOffset>
-            </wp:positionV>
-            <wp:extent cx="2485762" cy="1203424"/>
-            <wp:effectExtent b="0" l="0" r="0" t="0"/>
-            <wp:wrapSquare wrapText="bothSides" distB="114300" distT="114300" distL="114300" distR="114300"/>
-            <wp:docPr id="1" name="image7.png"/>
-            <a:graphic>
-              <a:graphicData uri="http://schemas.openxmlformats.org/drawingml/2006/picture">
-                <pic:pic>
-                  <pic:nvPicPr>
-                    <pic:cNvPr id="0" name="image7.png"/>
-                    <pic:cNvPicPr preferRelativeResize="0"/>
-                  </pic:nvPicPr>
-                  <pic:blipFill>
-                    <a:blip r:embed="rId16"/>
-                    <a:srcRect b="0" l="0" r="0" t="0"/>
-                    <a:stretch>
-                      <a:fillRect/>
-                    </a:stretch>
-                  </pic:blipFill>
-                  <pic:spPr>
-                    <a:xfrm>
-                      <a:off x="0" y="0"/>
-                      <a:ext cx="2485762" cy="1203424"/>
-                    </a:xfrm>
-                    <a:prstGeom prst="rect"/>
-                    <a:ln/>
-                  </pic:spPr>
-                </pic:pic>
-              </a:graphicData>
-            </a:graphic>
-          </wp:anchor>
-        </w:drawing>
+    </w:p>
+    <w:p>
+      <w:r>
+        <w:t>[Screenshot pending: this figure will show the redesigned DM Statistics panel (single t-statistic per model pair, no matrix) once Supabase is restored and the live app can be captured. The previous version of this figure was an early mockup with placeholder Lorem ipsum text and has been removed.]</w:t>
       </w:r>
     </w:p>
     <w:p>

</xml_diff>

<commit_message>
Doc: describe AR benchmark direct-forecast fallback and GDP-component lag-only rule
</commit_message>
<xml_diff>
--- a/Technical Documentation.docx
+++ b/Technical Documentation.docx
@@ -1041,19 +1041,17 @@
         <w:rPr>
           <w:rtl w:val="0"/>
         </w:rPr>
-        <w:t xml:space="preserve">In load_data.py, the latest FRED MD and QD data is extracted from the .csv links provided by FRED. Each series is then transformed based on the recommended transformation by McCracken and Ng (2016) for MD and McCracken and Ng (2020) for QD. The target variable is extracted from the log-differenced (the recommended transformation) GDPC1 series in QD and annualised by multiplying it by 400. We also drop columns that were dropped by both papers to create a balanced panel and remove irregular series without losing observations. We also removed series that are either highly correlated with GDP, like Real Value-Added Output (see Fig. 1), which are calculated from GDP figures</w:t>
+        <w:t>In load_data.py, the latest FRED MD and QD data is extracted from the .csv links provided by FRED. Each series is then transformed based on the recommended transformation by McCracken and Ng (2016) for MD and McCracken and Ng (2020) for QD. The target variable is extracted from the log-differenced (the recommended transformation) GDPC1 series in QD and annualised by multiplying it by 400. We also drop columns that were dropped by both papers to create a balanced panel and remove irregular series without losing observations. We also removed series that are either highly correlated with GDP, like Real Value-Added Output (see Fig. 1), which are calculated from GDP figures. Finally, we also dropped the series in QD that also appears in MD to avoid redundant information from the same variable being represented at two different frequencies, which would introduce multicollinearity and dilute the mixed-frequency signal that our models later rely on. Table A in the Appendix shows the full list of reasons behind why each series was dropped.  Real GDP components that remain in the dataset — PCECC96 (consumption), GPDIC1 (investment), and EXPGSC1 (exports) — are restricted to entering only as lags, never contemporaneously, for the same reason: using them same-quarter would let a model partially reconstruct GDP from its own components rather than genuinely forecast it.</w:t>
       </w:r>
       <w:r>
         <w:rPr>
           <w:vertAlign w:val="superscript"/>
         </w:rPr>
-        <w:footnoteReference w:customMarkFollows="0" w:id="0"/>
-      </w:r>
-      <w:r>
-        <w:rPr>
-          <w:rtl w:val="0"/>
-        </w:rPr>
-        <w:t xml:space="preserve">. Finally, we also dropped the series in QD that also appears in MD to avoid redundant information from the same variable being represented at two different frequencies, which would introduce multicollinearity and dilute the mixed-frequency signal that our models later rely on. Table A in the Appendix shows the full list of reasons behind why each series was dropped. </w:t>
+      </w:r>
+      <w:r>
+        <w:rPr>
+          <w:rtl w:val="0"/>
+        </w:rPr>
       </w:r>
     </w:p>
     <w:p>
@@ -1203,7 +1201,7 @@
         <w:rPr>
           <w:rtl w:val="0"/>
         </w:rPr>
-        <w:t xml:space="preserve">Our benchmark model is an AR(2) model. 2 lags were determined based on testing out a range of possible </w:t>
+        <w:t>Our benchmark model is an AR(2) model. 2 lags were determined based on testing out a range of possible p lags up to p = 12, and using the Aikaike Information Criterion (AIC) to determine that the optimal number of lags is two. The AR(2) model is implemented via Ordinary Least Squares (OLS) on two lagged predictors using the statsmodels package. The equation of the model is shown below. When the immediately preceding quarter's GDP is not yet released, the benchmark uses a direct 2-step forecast instead — regressing GDP growth on the t-2 and t-3 lags directly, rather than imputing the missing t-1 lag from another model's prediction. This keeps the benchmark a genuine floor: it only ever uses real, released GDP history.</w:t>
       </w:r>
       <w:r>
         <w:rPr>
@@ -1211,13 +1209,11 @@
           <w:iCs w:val="1"/>
           <w:rtl w:val="0"/>
         </w:rPr>
-        <w:t xml:space="preserve">p</w:t>
-      </w:r>
-      <w:r>
-        <w:rPr>
-          <w:rtl w:val="0"/>
-        </w:rPr>
-        <w:t xml:space="preserve"> lags up to </w:t>
+      </w:r>
+      <w:r>
+        <w:rPr>
+          <w:rtl w:val="0"/>
+        </w:rPr>
       </w:r>
       <w:r>
         <w:rPr>
@@ -1225,13 +1221,11 @@
           <w:iCs w:val="1"/>
           <w:rtl w:val="0"/>
         </w:rPr>
-        <w:t xml:space="preserve">p </w:t>
-      </w:r>
-      <w:r>
-        <w:rPr>
-          <w:rtl w:val="0"/>
-        </w:rPr>
-        <w:t xml:space="preserve">= 12, and using the Aikaike Information Criterion (AIC) to determine that the optimal number of lags is two. The AR(2) model is implemented via Ordinary Least Squares (OLS) on two lagged predictors using the statsmodels package. The equation of the model is shown below.</w:t>
+      </w:r>
+      <w:r>
+        <w:rPr>
+          <w:rtl w:val="0"/>
+        </w:rPr>
       </w:r>
     </w:p>
     <w:p>
@@ -3420,7 +3414,7 @@
         <w:rPr>
           <w:rtl w:val="0"/>
         </w:rPr>
-        <w:t xml:space="preserve">In order to compare our 6 models, we use three different measures. First, we compare both the root mean square forecast error and the mean absolute forecast error using a pseudo-out-of-sample forecast method. Second, we use the Diebold-Mariano (1995) test (DM test) for the null hypothesis of equal predictive accuracy to determine if the predictive superiority of our models is significant.</w:t>
+        <w:t>In order to compare our 6 models, we use three different measures. First, we compare both the root mean square forecast error and the mean absolute forecast error using a pseudo-out-of-sample forecast method. Second, we use the Diebold-Mariano (1995) test (DM test) for the null hypothesis of equal predictive accuracy to determine if the predictive superiority of our models is significant. Note: the RMSE and DM figures in this section (Tables 5-9, Appendix Tables B-D) predate the AR-benchmark, GDP-lag, and DM-loss-function fixes described above (Sections 2.2.1, 2.1.1, 2.3.3) — they are pending a re-run of the full historical POOS pipeline and will be refreshed in a follow-up update, not fabricated or hand-edited here.</w:t>
       </w:r>
     </w:p>
     <w:p>

</xml_diff>